<commit_message>
Deploy preview for PR 576 🛫
</commit_message>
<xml_diff>
--- a/pr-preview/pr-576/vignettes/articles/version-crosswalk-1.3-to-1.4.docx
+++ b/pr-preview/pr-576/vignettes/articles/version-crosswalk-1.3-to-1.4.docx
@@ -1699,70 +1699,70 @@
         <w:rPr>
           <w:rStyle w:val="VerbatimChar"/>
         </w:rPr>
-        <w:t xml:space="preserve">#&gt;     age id    antigen_iso   value</w:t>
-      </w:r>
-      <w:r>
-        <w:br/>
-      </w:r>
-      <w:r>
-        <w:rPr>
-          <w:rStyle w:val="VerbatimChar"/>
-        </w:rPr>
-        <w:t xml:space="preserve">#&gt;   &lt;dbl&gt; &lt;chr&gt; &lt;chr&gt;         &lt;dbl&gt;</w:t>
-      </w:r>
-      <w:r>
-        <w:br/>
-      </w:r>
-      <w:r>
-        <w:rPr>
-          <w:rStyle w:val="VerbatimChar"/>
-        </w:rPr>
-        <w:t xml:space="preserve">#&gt; 1 17.0  1     HlyE_IgA      0.592</w:t>
-      </w:r>
-      <w:r>
-        <w:br/>
-      </w:r>
-      <w:r>
-        <w:rPr>
-          <w:rStyle w:val="VerbatimChar"/>
-        </w:rPr>
-        <w:t xml:space="preserve">#&gt; 2 17.0  1     HlyE_IgG      0.940</w:t>
-      </w:r>
-      <w:r>
-        <w:br/>
-      </w:r>
-      <w:r>
-        <w:rPr>
-          <w:rStyle w:val="VerbatimChar"/>
-        </w:rPr>
-        <w:t xml:space="preserve">#&gt; 3  0.47 2     HlyE_IgA      0.733</w:t>
-      </w:r>
-      <w:r>
-        <w:br/>
-      </w:r>
-      <w:r>
-        <w:rPr>
-          <w:rStyle w:val="VerbatimChar"/>
-        </w:rPr>
-        <w:t xml:space="preserve">#&gt; 4  0.47 2     HlyE_IgG      0.290</w:t>
-      </w:r>
-      <w:r>
-        <w:br/>
-      </w:r>
-      <w:r>
-        <w:rPr>
-          <w:rStyle w:val="VerbatimChar"/>
-        </w:rPr>
-        <w:t xml:space="preserve">#&gt; 5  6.38 3     HlyE_IgA      0.980</w:t>
-      </w:r>
-      <w:r>
-        <w:br/>
-      </w:r>
-      <w:r>
-        <w:rPr>
-          <w:rStyle w:val="VerbatimChar"/>
-        </w:rPr>
-        <w:t xml:space="preserve">#&gt; 6  6.38 3     HlyE_IgG    552.</w:t>
+        <w:t xml:space="preserve">#&gt;     age id    antigen_iso value</w:t>
+      </w:r>
+      <w:r>
+        <w:br/>
+      </w:r>
+      <w:r>
+        <w:rPr>
+          <w:rStyle w:val="VerbatimChar"/>
+        </w:rPr>
+        <w:t xml:space="preserve">#&gt;   &lt;dbl&gt; &lt;chr&gt; &lt;chr&gt;       &lt;dbl&gt;</w:t>
+      </w:r>
+      <w:r>
+        <w:br/>
+      </w:r>
+      <w:r>
+        <w:rPr>
+          <w:rStyle w:val="VerbatimChar"/>
+        </w:rPr>
+        <w:t xml:space="preserve">#&gt; 1  6.99 1     HlyE_IgA    3.69 </w:t>
+      </w:r>
+      <w:r>
+        <w:br/>
+      </w:r>
+      <w:r>
+        <w:rPr>
+          <w:rStyle w:val="VerbatimChar"/>
+        </w:rPr>
+        <w:t xml:space="preserve">#&gt; 2  6.99 1     HlyE_IgG    4.26 </w:t>
+      </w:r>
+      <w:r>
+        <w:br/>
+      </w:r>
+      <w:r>
+        <w:rPr>
+          <w:rStyle w:val="VerbatimChar"/>
+        </w:rPr>
+        <w:t xml:space="preserve">#&gt; 3 15.5  2     HlyE_IgA    0.915</w:t>
+      </w:r>
+      <w:r>
+        <w:br/>
+      </w:r>
+      <w:r>
+        <w:rPr>
+          <w:rStyle w:val="VerbatimChar"/>
+        </w:rPr>
+        <w:t xml:space="preserve">#&gt; 4 15.5  2     HlyE_IgG    3.56 </w:t>
+      </w:r>
+      <w:r>
+        <w:br/>
+      </w:r>
+      <w:r>
+        <w:rPr>
+          <w:rStyle w:val="VerbatimChar"/>
+        </w:rPr>
+        <w:t xml:space="preserve">#&gt; 5 14.9  3     HlyE_IgA    0.720</w:t>
+      </w:r>
+      <w:r>
+        <w:br/>
+      </w:r>
+      <w:r>
+        <w:rPr>
+          <w:rStyle w:val="VerbatimChar"/>
+        </w:rPr>
+        <w:t xml:space="preserve">#&gt; 6 14.9  3     HlyE_IgG    0.620</w:t>
       </w:r>
       <w:r>
         <w:br/>

</xml_diff>